<commit_message>
The take-home sheet, merged (John, 2026-09-09): the school series' check-off cards and the four-part homework are now one page. Every session's sheet carries the two practices with a seven-box row under each week (one box per day; fewer-than-daily practices check the days done), a Done box on the check-in and the prep sentence, the cards' grace note restored - a missed box is never a failure, it is an invitation to return - the standing teach-back closer, the next-evening line, and the door out. Template updated to match; all twenty-two sheets regenerated and re-synced to the FotH 2026 Homework Handouts folder. DEV ONLY.
Co-Authored-By: Claude Fable 5 <noreply@anthropic.com>
</commit_message>
<xml_diff>
--- a/_implementation-notes/evening-series/FotH Pilot Homework Handout Template DRAFT v1.docx
+++ b/_implementation-notes/evening-series/FotH Pilot Homework Handout Template DRAFT v1.docx
@@ -2,13 +2,13 @@
 <file path=word/document.xml><?xml version="1.0" encoding="utf-8"?>
 <w:document xmlns:w="http://schemas.openxmlformats.org/wordprocessingml/2006/main" xmlns:m="http://schemas.openxmlformats.org/officeDocument/2006/math" xmlns:r="http://schemas.openxmlformats.org/officeDocument/2006/relationships" xmlns:o="urn:schemas-microsoft-com:office:office" xmlns:v="urn:schemas-microsoft-com:vml" xmlns:w10="urn:schemas-microsoft-com:office:word" xmlns:a="http://schemas.openxmlformats.org/drawingml/2006/main" xmlns:pic="http://schemas.openxmlformats.org/drawingml/2006/picture" xmlns:wp="http://schemas.openxmlformats.org/drawingml/2006/wordprocessingDrawing">
   <w:body>
-    <w:bookmarkStart w:id="13" w:name="X2d447a047a5d098cce72487c98ec921fd444e42"/>
+    <w:bookmarkStart w:id="13" w:name="X108a8b282dc5bc230bae858a9550d863e6f9af9"/>
     <w:p>
       <w:pPr>
         <w:pStyle w:val="Heading1"/>
       </w:pPr>
       <w:r>
-        <w:t xml:space="preserve">Homework Handout — Session ___ : ______________________</w:t>
+        <w:t xml:space="preserve">Take-Home Sheet — Session ___ : ______________________</w:t>
       </w:r>
     </w:p>
     <w:p>
@@ -20,7 +20,7 @@
           <w:b/>
           <w:bCs/>
         </w:rPr>
-        <w:t xml:space="preserve">Two weeks. Four parts. One page.</w:t>
+        <w:t xml:space="preserve">Two weeks on one sheet: the practices, the boxes, the check-in.</w:t>
       </w:r>
       <w:r>
         <w:t xml:space="preserve"> </w:t>
@@ -30,7 +30,7 @@
           <w:i/>
           <w:iCs/>
         </w:rPr>
-        <w:t xml:space="preserve">(Template: fill the italics per</w:t>
+        <w:t xml:space="preserve">(Template: fill the italics per session; hand one to every participant at</w:t>
       </w:r>
       <w:r>
         <w:rPr>
@@ -44,7 +44,7 @@
           <w:i/>
           <w:iCs/>
         </w:rPr>
-        <w:t xml:space="preserve">session; hand one to every participant at commissioning.)</w:t>
+        <w:t xml:space="preserve">commissioning. Fridge, mirror, or notebook pocket.)</w:t>
       </w:r>
     </w:p>
     <w:p>
@@ -89,6 +89,34 @@
         <w:t xml:space="preserve">minutes a day or in one sitting, exactly as the session taught it.</w:t>
       </w:r>
     </w:p>
+    <w:p>
+      <w:pPr>
+        <w:pStyle w:val="BodyText"/>
+      </w:pPr>
+      <w:r>
+        <w:rPr>
+          <w:b/>
+          <w:bCs/>
+        </w:rPr>
+        <w:t xml:space="preserve">Week one:</w:t>
+      </w:r>
+      <w:r>
+        <w:t xml:space="preserve"> </w:t>
+      </w:r>
+      <w:r>
+        <w:t xml:space="preserve">☐ ☐ ☐ ☐ ☐ ☐ ☐</w:t>
+      </w:r>
+      <w:r>
+        <w:t xml:space="preserve"> </w:t>
+      </w:r>
+      <w:r>
+        <w:rPr>
+          <w:i/>
+          <w:iCs/>
+        </w:rPr>
+        <w:t xml:space="preserve">(one box per day; if the practice asks for fewer, check the days you did it)</w:t>
+      </w:r>
+    </w:p>
     <w:bookmarkEnd w:id="9"/>
     <w:bookmarkStart w:id="10" w:name="the-end-of-week-one-check-in"/>
     <w:p>
@@ -146,6 +174,22 @@
       <w:r>
         <w:t xml:space="preserve">count. You are not grading each other; you are expecting each other.</w:t>
       </w:r>
+      <w:r>
+        <w:t xml:space="preserve"> </w:t>
+      </w:r>
+      <w:r>
+        <w:rPr>
+          <w:b/>
+          <w:bCs/>
+        </w:rPr>
+        <w:t xml:space="preserve">Done:</w:t>
+      </w:r>
+      <w:r>
+        <w:t xml:space="preserve"> </w:t>
+      </w:r>
+      <w:r>
+        <w:t xml:space="preserve">☐</w:t>
+      </w:r>
     </w:p>
     <w:bookmarkEnd w:id="10"/>
     <w:bookmarkStart w:id="11" w:name="the-practice-week-two"/>
@@ -183,6 +227,24 @@
         <w:t xml:space="preserve">or two sentences.</w:t>
       </w:r>
     </w:p>
+    <w:p>
+      <w:pPr>
+        <w:pStyle w:val="BodyText"/>
+      </w:pPr>
+      <w:r>
+        <w:rPr>
+          <w:b/>
+          <w:bCs/>
+        </w:rPr>
+        <w:t xml:space="preserve">Week two:</w:t>
+      </w:r>
+      <w:r>
+        <w:t xml:space="preserve"> </w:t>
+      </w:r>
+      <w:r>
+        <w:t xml:space="preserve">☐ ☐ ☐ ☐ ☐ ☐ ☐</w:t>
+      </w:r>
+    </w:p>
     <w:bookmarkEnd w:id="11"/>
     <w:bookmarkStart w:id="12" w:name="one-sentence-of-preparation"/>
     <w:p>
@@ -217,6 +279,22 @@
           <w:iCs/>
         </w:rPr>
         <w:t xml:space="preserve">evening — written here.</w:t>
+      </w:r>
+      <w:r>
+        <w:t xml:space="preserve"> </w:t>
+      </w:r>
+      <w:r>
+        <w:rPr>
+          <w:b/>
+          <w:bCs/>
+        </w:rPr>
+        <w:t xml:space="preserve">Done:</w:t>
+      </w:r>
+      <w:r>
+        <w:t xml:space="preserve"> </w:t>
+      </w:r>
+      <w:r>
+        <w:t xml:space="preserve">☐</w:t>
       </w:r>
     </w:p>
     <w:p>
@@ -229,6 +307,18 @@
     <w:p>
       <w:pPr>
         <w:pStyle w:val="FirstParagraph"/>
+      </w:pPr>
+      <w:r>
+        <w:rPr>
+          <w:i/>
+          <w:iCs/>
+        </w:rPr>
+        <w:t xml:space="preserve">A missed box is never a failure — it is an invitation to return.</w:t>
+      </w:r>
+    </w:p>
+    <w:p>
+      <w:pPr>
+        <w:pStyle w:val="BodyText"/>
       </w:pPr>
       <w:r>
         <w:rPr>

</xml_diff>

<commit_message>
The take-home sheet simplified to John's edit of the template (2026-09-09: two pages was too much, a feel call). The sheet is now title, the four parts with their box rows and Done boxes, and the grace note as the only closer; the subtitle, the teach-back closer, the next-evening line, and the door out are cut from the sheet - the room says those things, and the deck and handbook hold them. Sessions 1 and 5 filled in the new form (the two questions with week-two abundance; one friendship one condition with the second-condition week and the finish-the-sentence prep); template md matched to his design. The other twenty sheets regenerate on his word once the two samples pass. DEV ONLY.
Co-Authored-By: Claude Fable 5 <noreply@anthropic.com>
</commit_message>
<xml_diff>
--- a/_implementation-notes/evening-series/FotH Pilot Homework Handout Template DRAFT v1.docx
+++ b/_implementation-notes/evening-series/FotH Pilot Homework Handout Template DRAFT v1.docx
@@ -2,49 +2,37 @@
 <file path=word/document.xml><?xml version="1.0" encoding="utf-8"?>
 <w:document xmlns:w="http://schemas.openxmlformats.org/wordprocessingml/2006/main" xmlns:m="http://schemas.openxmlformats.org/officeDocument/2006/math" xmlns:r="http://schemas.openxmlformats.org/officeDocument/2006/relationships" xmlns:o="urn:schemas-microsoft-com:office:office" xmlns:v="urn:schemas-microsoft-com:vml" xmlns:w10="urn:schemas-microsoft-com:office:word" xmlns:a="http://schemas.openxmlformats.org/drawingml/2006/main" xmlns:pic="http://schemas.openxmlformats.org/drawingml/2006/picture" xmlns:wp="http://schemas.openxmlformats.org/drawingml/2006/wordprocessingDrawing">
   <w:body>
-    <w:bookmarkStart w:id="13" w:name="X108a8b282dc5bc230bae858a9550d863e6f9af9"/>
+    <w:bookmarkStart w:id="13" w:name="X5c0733d94be64e1cd14c2437425c8fe5cc5d2cc"/>
     <w:p>
       <w:pPr>
         <w:pStyle w:val="Heading1"/>
       </w:pPr>
       <w:r>
-        <w:t xml:space="preserve">Take-Home Sheet — Session ___ : ______________________</w:t>
-      </w:r>
-    </w:p>
-    <w:p>
-      <w:pPr>
-        <w:pStyle w:val="FirstParagraph"/>
-      </w:pPr>
+        <w:t xml:space="preserve">Take-Home Sheet — Session</w:t>
+      </w:r>
+      <w:r>
+        <w:t xml:space="preserve"> </w:t>
+      </w:r>
       <w:r>
         <w:rPr>
           <w:b/>
           <w:bCs/>
-        </w:rPr>
-        <w:t xml:space="preserve">Two weeks on one sheet: the practices, the boxes, the check-in.</w:t>
-      </w:r>
-      <w:r>
-        <w:t xml:space="preserve"> </w:t>
-      </w:r>
-      <w:r>
-        <w:rPr>
           <w:i/>
           <w:iCs/>
         </w:rPr>
-        <w:t xml:space="preserve">(Template: fill the italics per session; hand one to every participant at</w:t>
-      </w:r>
-      <w:r>
-        <w:rPr>
+        <w:t xml:space="preserve">:</w:t>
+      </w:r>
+      <w:r>
+        <w:rPr>
+          <w:b/>
+          <w:bCs/>
           <w:i/>
           <w:iCs/>
         </w:rPr>
         <w:t xml:space="preserve"> </w:t>
       </w:r>
       <w:r>
-        <w:rPr>
-          <w:i/>
-          <w:iCs/>
-        </w:rPr>
-        <w:t xml:space="preserve">commissioning. Fridge, mirror, or notebook pocket.)</w:t>
+        <w:t xml:space="preserve">___________________</w:t>
       </w:r>
     </w:p>
     <w:p>
@@ -160,19 +148,19 @@
         <w:pStyle w:val="BodyText"/>
       </w:pPr>
       <w:r>
-        <w:t xml:space="preserve">At the end of week one, connect with your partner and report how it’s</w:t>
+        <w:t xml:space="preserve">At the end of week one, connect with your partner and report how it’s going</w:t>
       </w:r>
       <w:r>
         <w:t xml:space="preserve"> </w:t>
       </w:r>
       <w:r>
-        <w:t xml:space="preserve">going against the practice. A text, a call, or a hallway conversation all</w:t>
+        <w:t xml:space="preserve">against the practice. A text, a call, or a hallway conversation all count.</w:t>
       </w:r>
       <w:r>
         <w:t xml:space="preserve"> </w:t>
       </w:r>
       <w:r>
-        <w:t xml:space="preserve">count. You are not grading each other; you are expecting each other.</w:t>
+        <w:t xml:space="preserve">You are not grading each other; you are expecting each other.</w:t>
       </w:r>
       <w:r>
         <w:t xml:space="preserve"> </w:t>
@@ -210,7 +198,7 @@
           <w:i/>
           <w:iCs/>
         </w:rPr>
-        <w:t xml:space="preserve">Continue, deepen, or repeat, as the session specifies — written here in one</w:t>
+        <w:t xml:space="preserve">Continue, deepen, or repeat, as the session specifies — written here in</w:t>
       </w:r>
       <w:r>
         <w:rPr>
@@ -224,7 +212,7 @@
           <w:i/>
           <w:iCs/>
         </w:rPr>
-        <w:t xml:space="preserve">or two sentences.</w:t>
+        <w:t xml:space="preserve">one or two sentences.</w:t>
       </w:r>
     </w:p>
     <w:p>
@@ -314,109 +302,6 @@
           <w:iCs/>
         </w:rPr>
         <w:t xml:space="preserve">A missed box is never a failure — it is an invitation to return.</w:t>
-      </w:r>
-    </w:p>
-    <w:p>
-      <w:pPr>
-        <w:pStyle w:val="BodyText"/>
-      </w:pPr>
-      <w:r>
-        <w:rPr>
-          <w:b/>
-          <w:bCs/>
-        </w:rPr>
-        <w:t xml:space="preserve">The journal’s standing closer, every week:</w:t>
-      </w:r>
-      <w:r>
-        <w:t xml:space="preserve"> </w:t>
-      </w:r>
-      <w:r>
-        <w:rPr>
-          <w:i/>
-          <w:iCs/>
-        </w:rPr>
-        <w:t xml:space="preserve">if I were to teach this</w:t>
-      </w:r>
-      <w:r>
-        <w:rPr>
-          <w:i/>
-          <w:iCs/>
-        </w:rPr>
-        <w:t xml:space="preserve"> </w:t>
-      </w:r>
-      <w:r>
-        <w:rPr>
-          <w:i/>
-          <w:iCs/>
-        </w:rPr>
-        <w:t xml:space="preserve">practice to someone, what would I tell them?</w:t>
-      </w:r>
-    </w:p>
-    <w:p>
-      <w:pPr>
-        <w:pStyle w:val="BodyText"/>
-      </w:pPr>
-      <w:r>
-        <w:rPr>
-          <w:b/>
-          <w:bCs/>
-        </w:rPr>
-        <w:t xml:space="preserve">Next evening:</w:t>
-      </w:r>
-      <w:r>
-        <w:t xml:space="preserve"> </w:t>
-      </w:r>
-      <w:r>
-        <w:t xml:space="preserve">____________ (Mon/Tue of the week of ____________), dinner</w:t>
-      </w:r>
-      <w:r>
-        <w:t xml:space="preserve"> </w:t>
-      </w:r>
-      <w:r>
-        <w:t xml:space="preserve">at 6:00, session at 7:00.</w:t>
-      </w:r>
-    </w:p>
-    <w:p>
-      <w:pPr>
-        <w:pStyle w:val="BodyText"/>
-      </w:pPr>
-      <w:r>
-        <w:rPr>
-          <w:b/>
-          <w:bCs/>
-        </w:rPr>
-        <w:t xml:space="preserve">The door out:</w:t>
-      </w:r>
-      <w:r>
-        <w:t xml:space="preserve"> </w:t>
-      </w:r>
-      <w:r>
-        <w:t xml:space="preserve">if anything from this work needs an adult outside the</w:t>
-      </w:r>
-      <w:r>
-        <w:t xml:space="preserve"> </w:t>
-      </w:r>
-      <w:r>
-        <w:t xml:space="preserve">leading team, that person is</w:t>
-      </w:r>
-      <w:r>
-        <w:t xml:space="preserve"> </w:t>
-      </w:r>
-      <w:r>
-        <w:rPr>
-          <w:b/>
-          <w:bCs/>
-        </w:rPr>
-        <w:t xml:space="preserve">______________________</w:t>
-      </w:r>
-      <w:r>
-        <w:t xml:space="preserve">, and going to them</w:t>
-      </w:r>
-      <w:r>
-        <w:t xml:space="preserve"> </w:t>
-      </w:r>
-      <w:r>
-        <w:t xml:space="preserve">is always the right move.</w:t>
       </w:r>
     </w:p>
     <w:bookmarkEnd w:id="12"/>

</xml_diff>

<commit_message>
Day letters restored above the boxes on every take-home sheet (John's word, 2026-09-10, as the cards had before): each week's row is now a small seven-column grid, M Tu W Th F Sa Su over the check boxes, on all twenty-two sheets and the template. Rebuilt and re-synced to FotH 2026. DEV ONLY.
Co-Authored-By: Claude Fable 5 <noreply@anthropic.com>
</commit_message>
<xml_diff>
--- a/_implementation-notes/evening-series/FotH Pilot Homework Handout Template DRAFT v1.docx
+++ b/_implementation-notes/evening-series/FotH Pilot Homework Handout Template DRAFT v1.docx
@@ -86,13 +86,7 @@
           <w:b/>
           <w:bCs/>
         </w:rPr>
-        <w:t xml:space="preserve">Week one:</w:t>
-      </w:r>
-      <w:r>
-        <w:t xml:space="preserve"> </w:t>
-      </w:r>
-      <w:r>
-        <w:t xml:space="preserve">☐ ☐ ☐ ☐ ☐ ☐ ☐</w:t>
+        <w:t xml:space="preserve">Week one</w:t>
       </w:r>
       <w:r>
         <w:t xml:space="preserve"> </w:t>
@@ -105,6 +99,197 @@
         <w:t xml:space="preserve">(one box per day; if the practice asks for fewer, check the days you did it)</w:t>
       </w:r>
     </w:p>
+    <w:tbl>
+      <w:tblPr>
+        <w:tblStyle w:val="Table"/>
+        <w:tblW w:type="auto" w:w="0"/>
+        <w:tblLook w:firstRow="1" w:lastRow="0" w:firstColumn="0" w:lastColumn="0" w:noHBand="0" w:noVBand="0" w:val="0020"/>
+      </w:tblPr>
+      <w:tblGrid>
+        <w:gridCol w:w="1131"/>
+        <w:gridCol w:w="1131"/>
+        <w:gridCol w:w="1131"/>
+        <w:gridCol w:w="1131"/>
+        <w:gridCol w:w="1131"/>
+        <w:gridCol w:w="1131"/>
+        <w:gridCol w:w="1131"/>
+      </w:tblGrid>
+      <w:tr>
+        <w:trPr>
+          <w:tblHeader w:val="on"/>
+        </w:trPr>
+        <w:tc>
+          <w:tcPr/>
+          <w:p>
+            <w:pPr>
+              <w:pStyle w:val="Compact"/>
+              <w:jc w:val="center"/>
+            </w:pPr>
+            <w:r>
+              <w:t xml:space="preserve">M</w:t>
+            </w:r>
+          </w:p>
+        </w:tc>
+        <w:tc>
+          <w:tcPr/>
+          <w:p>
+            <w:pPr>
+              <w:pStyle w:val="Compact"/>
+              <w:jc w:val="center"/>
+            </w:pPr>
+            <w:r>
+              <w:t xml:space="preserve">Tu</w:t>
+            </w:r>
+          </w:p>
+        </w:tc>
+        <w:tc>
+          <w:tcPr/>
+          <w:p>
+            <w:pPr>
+              <w:pStyle w:val="Compact"/>
+              <w:jc w:val="center"/>
+            </w:pPr>
+            <w:r>
+              <w:t xml:space="preserve">W</w:t>
+            </w:r>
+          </w:p>
+        </w:tc>
+        <w:tc>
+          <w:tcPr/>
+          <w:p>
+            <w:pPr>
+              <w:pStyle w:val="Compact"/>
+              <w:jc w:val="center"/>
+            </w:pPr>
+            <w:r>
+              <w:t xml:space="preserve">Th</w:t>
+            </w:r>
+          </w:p>
+        </w:tc>
+        <w:tc>
+          <w:tcPr/>
+          <w:p>
+            <w:pPr>
+              <w:pStyle w:val="Compact"/>
+              <w:jc w:val="center"/>
+            </w:pPr>
+            <w:r>
+              <w:t xml:space="preserve">F</w:t>
+            </w:r>
+          </w:p>
+        </w:tc>
+        <w:tc>
+          <w:tcPr/>
+          <w:p>
+            <w:pPr>
+              <w:pStyle w:val="Compact"/>
+              <w:jc w:val="center"/>
+            </w:pPr>
+            <w:r>
+              <w:t xml:space="preserve">Sa</w:t>
+            </w:r>
+          </w:p>
+        </w:tc>
+        <w:tc>
+          <w:tcPr/>
+          <w:p>
+            <w:pPr>
+              <w:pStyle w:val="Compact"/>
+              <w:jc w:val="center"/>
+            </w:pPr>
+            <w:r>
+              <w:t xml:space="preserve">Su</w:t>
+            </w:r>
+          </w:p>
+        </w:tc>
+      </w:tr>
+      <w:tr>
+        <w:tc>
+          <w:tcPr/>
+          <w:p>
+            <w:pPr>
+              <w:pStyle w:val="Compact"/>
+              <w:jc w:val="center"/>
+            </w:pPr>
+            <w:r>
+              <w:t xml:space="preserve">☐</w:t>
+            </w:r>
+          </w:p>
+        </w:tc>
+        <w:tc>
+          <w:tcPr/>
+          <w:p>
+            <w:pPr>
+              <w:pStyle w:val="Compact"/>
+              <w:jc w:val="center"/>
+            </w:pPr>
+            <w:r>
+              <w:t xml:space="preserve">☐</w:t>
+            </w:r>
+          </w:p>
+        </w:tc>
+        <w:tc>
+          <w:tcPr/>
+          <w:p>
+            <w:pPr>
+              <w:pStyle w:val="Compact"/>
+              <w:jc w:val="center"/>
+            </w:pPr>
+            <w:r>
+              <w:t xml:space="preserve">☐</w:t>
+            </w:r>
+          </w:p>
+        </w:tc>
+        <w:tc>
+          <w:tcPr/>
+          <w:p>
+            <w:pPr>
+              <w:pStyle w:val="Compact"/>
+              <w:jc w:val="center"/>
+            </w:pPr>
+            <w:r>
+              <w:t xml:space="preserve">☐</w:t>
+            </w:r>
+          </w:p>
+        </w:tc>
+        <w:tc>
+          <w:tcPr/>
+          <w:p>
+            <w:pPr>
+              <w:pStyle w:val="Compact"/>
+              <w:jc w:val="center"/>
+            </w:pPr>
+            <w:r>
+              <w:t xml:space="preserve">☐</w:t>
+            </w:r>
+          </w:p>
+        </w:tc>
+        <w:tc>
+          <w:tcPr/>
+          <w:p>
+            <w:pPr>
+              <w:pStyle w:val="Compact"/>
+              <w:jc w:val="center"/>
+            </w:pPr>
+            <w:r>
+              <w:t xml:space="preserve">☐</w:t>
+            </w:r>
+          </w:p>
+        </w:tc>
+        <w:tc>
+          <w:tcPr/>
+          <w:p>
+            <w:pPr>
+              <w:pStyle w:val="Compact"/>
+              <w:jc w:val="center"/>
+            </w:pPr>
+            <w:r>
+              <w:t xml:space="preserve">☐</w:t>
+            </w:r>
+          </w:p>
+        </w:tc>
+      </w:tr>
+    </w:tbl>
     <w:bookmarkEnd w:id="9"/>
     <w:bookmarkStart w:id="10" w:name="the-end-of-week-one-check-in"/>
     <w:p>
@@ -224,15 +409,200 @@
           <w:b/>
           <w:bCs/>
         </w:rPr>
-        <w:t xml:space="preserve">Week two:</w:t>
-      </w:r>
-      <w:r>
-        <w:t xml:space="preserve"> </w:t>
-      </w:r>
-      <w:r>
-        <w:t xml:space="preserve">☐ ☐ ☐ ☐ ☐ ☐ ☐</w:t>
+        <w:t xml:space="preserve">Week two</w:t>
       </w:r>
     </w:p>
+    <w:tbl>
+      <w:tblPr>
+        <w:tblStyle w:val="Table"/>
+        <w:tblW w:type="auto" w:w="0"/>
+        <w:tblLook w:firstRow="1" w:lastRow="0" w:firstColumn="0" w:lastColumn="0" w:noHBand="0" w:noVBand="0" w:val="0020"/>
+      </w:tblPr>
+      <w:tblGrid>
+        <w:gridCol w:w="1131"/>
+        <w:gridCol w:w="1131"/>
+        <w:gridCol w:w="1131"/>
+        <w:gridCol w:w="1131"/>
+        <w:gridCol w:w="1131"/>
+        <w:gridCol w:w="1131"/>
+        <w:gridCol w:w="1131"/>
+      </w:tblGrid>
+      <w:tr>
+        <w:trPr>
+          <w:tblHeader w:val="on"/>
+        </w:trPr>
+        <w:tc>
+          <w:tcPr/>
+          <w:p>
+            <w:pPr>
+              <w:pStyle w:val="Compact"/>
+              <w:jc w:val="center"/>
+            </w:pPr>
+            <w:r>
+              <w:t xml:space="preserve">M</w:t>
+            </w:r>
+          </w:p>
+        </w:tc>
+        <w:tc>
+          <w:tcPr/>
+          <w:p>
+            <w:pPr>
+              <w:pStyle w:val="Compact"/>
+              <w:jc w:val="center"/>
+            </w:pPr>
+            <w:r>
+              <w:t xml:space="preserve">Tu</w:t>
+            </w:r>
+          </w:p>
+        </w:tc>
+        <w:tc>
+          <w:tcPr/>
+          <w:p>
+            <w:pPr>
+              <w:pStyle w:val="Compact"/>
+              <w:jc w:val="center"/>
+            </w:pPr>
+            <w:r>
+              <w:t xml:space="preserve">W</w:t>
+            </w:r>
+          </w:p>
+        </w:tc>
+        <w:tc>
+          <w:tcPr/>
+          <w:p>
+            <w:pPr>
+              <w:pStyle w:val="Compact"/>
+              <w:jc w:val="center"/>
+            </w:pPr>
+            <w:r>
+              <w:t xml:space="preserve">Th</w:t>
+            </w:r>
+          </w:p>
+        </w:tc>
+        <w:tc>
+          <w:tcPr/>
+          <w:p>
+            <w:pPr>
+              <w:pStyle w:val="Compact"/>
+              <w:jc w:val="center"/>
+            </w:pPr>
+            <w:r>
+              <w:t xml:space="preserve">F</w:t>
+            </w:r>
+          </w:p>
+        </w:tc>
+        <w:tc>
+          <w:tcPr/>
+          <w:p>
+            <w:pPr>
+              <w:pStyle w:val="Compact"/>
+              <w:jc w:val="center"/>
+            </w:pPr>
+            <w:r>
+              <w:t xml:space="preserve">Sa</w:t>
+            </w:r>
+          </w:p>
+        </w:tc>
+        <w:tc>
+          <w:tcPr/>
+          <w:p>
+            <w:pPr>
+              <w:pStyle w:val="Compact"/>
+              <w:jc w:val="center"/>
+            </w:pPr>
+            <w:r>
+              <w:t xml:space="preserve">Su</w:t>
+            </w:r>
+          </w:p>
+        </w:tc>
+      </w:tr>
+      <w:tr>
+        <w:tc>
+          <w:tcPr/>
+          <w:p>
+            <w:pPr>
+              <w:pStyle w:val="Compact"/>
+              <w:jc w:val="center"/>
+            </w:pPr>
+            <w:r>
+              <w:t xml:space="preserve">☐</w:t>
+            </w:r>
+          </w:p>
+        </w:tc>
+        <w:tc>
+          <w:tcPr/>
+          <w:p>
+            <w:pPr>
+              <w:pStyle w:val="Compact"/>
+              <w:jc w:val="center"/>
+            </w:pPr>
+            <w:r>
+              <w:t xml:space="preserve">☐</w:t>
+            </w:r>
+          </w:p>
+        </w:tc>
+        <w:tc>
+          <w:tcPr/>
+          <w:p>
+            <w:pPr>
+              <w:pStyle w:val="Compact"/>
+              <w:jc w:val="center"/>
+            </w:pPr>
+            <w:r>
+              <w:t xml:space="preserve">☐</w:t>
+            </w:r>
+          </w:p>
+        </w:tc>
+        <w:tc>
+          <w:tcPr/>
+          <w:p>
+            <w:pPr>
+              <w:pStyle w:val="Compact"/>
+              <w:jc w:val="center"/>
+            </w:pPr>
+            <w:r>
+              <w:t xml:space="preserve">☐</w:t>
+            </w:r>
+          </w:p>
+        </w:tc>
+        <w:tc>
+          <w:tcPr/>
+          <w:p>
+            <w:pPr>
+              <w:pStyle w:val="Compact"/>
+              <w:jc w:val="center"/>
+            </w:pPr>
+            <w:r>
+              <w:t xml:space="preserve">☐</w:t>
+            </w:r>
+          </w:p>
+        </w:tc>
+        <w:tc>
+          <w:tcPr/>
+          <w:p>
+            <w:pPr>
+              <w:pStyle w:val="Compact"/>
+              <w:jc w:val="center"/>
+            </w:pPr>
+            <w:r>
+              <w:t xml:space="preserve">☐</w:t>
+            </w:r>
+          </w:p>
+        </w:tc>
+        <w:tc>
+          <w:tcPr/>
+          <w:p>
+            <w:pPr>
+              <w:pStyle w:val="Compact"/>
+              <w:jc w:val="center"/>
+            </w:pPr>
+            <w:r>
+              <w:t xml:space="preserve">☐</w:t>
+            </w:r>
+          </w:p>
+        </w:tc>
+      </w:tr>
+    </w:tbl>
     <w:bookmarkEnd w:id="11"/>
     <w:bookmarkStart w:id="12" w:name="one-sentence-of-preparation"/>
     <w:p>

</xml_diff>